<commit_message>
Update SBL Co approval sections — Puan Wan Norizan Binti Wan Badaruzaman
Applied to: CU1-06, CU4-01, CU4-02, CU4-03, CU5-01, CU5-02

https://claude.ai/code/session_014PMHBCAP9JQm22YBf67CdD
</commit_message>
<xml_diff>
--- a/CU1-Social-Media/CU1-06-Optimization-Report.docx
+++ b/CU1-Social-Media/CU1-06-Optimization-Report.docx
@@ -2057,7 +2057,9 @@
               <w:rPr>
                 <w:sz w:val="18"/>
               </w:rPr>
-              <w:t>[Pending — Koperasi WI Representative]</w:t>
+              <w:t>Puan Wan Norizan Binti Wan Badaruzaman</w:t>
+              <w:br/>
+              <w:t>Koperasi WI</w:t>
             </w:r>
           </w:p>
         </w:tc>

</xml_diff>